<commit_message>
Make repository import non-blocking in lab instructions
Co-authored-by: Copilot App <223556219+Copilot@users.noreply.github.com>
</commit_message>
<xml_diff>
--- a/LAB720-Ignite-Day-Lab-25min.docx
+++ b/LAB720-Ignite-Day-Lab-25min.docx
@@ -119,7 +119,7 @@
         <w:spacing w:after="60"/>
       </w:pPr>
       <w:r>
-        <w:t>Import the lab's GitHub repository, which you'll need later in the lab.</w:t>
+        <w:t>Start importing the lab's GitHub repository in the background, then confirm it is ready before the debugging activity.</w:t>
       </w:r>
     </w:p>
     <w:p>
@@ -238,7 +238,7 @@
         <w:pStyle w:val="Heading2"/>
       </w:pPr>
       <w:r>
-        <w:t>Get started</w:t>
+        <w:t>Clone the repo</w:t>
       </w:r>
     </w:p>
     <w:p>
@@ -254,7 +254,7 @@
       </w:r>
       <w:proofErr w:type="spellEnd"/>
       <w:r>
-        <w:t xml:space="preserve"> source code, including the ASP.NET Core backend and the static storefront frontend, lives in a GitHub repository. You'll import it now so it's ready for later — the SRE Agent reads directly from this repo during the Debug task to connect a configuration problem back to the exact line of code that is affected.</w:t>
+        <w:t xml:space="preserve"> source code, including the ASP.NET Core backend and the static storefront frontend, lives in a GitHub repository. You'll start the import now and let it run in the background while you continue the lab — the SRE Agent reads directly from this repo during the Debug task to connect a configuration problem back to the exact line of code that is affected.</w:t>
       </w:r>
     </w:p>
     <w:p>
@@ -445,7 +445,7 @@
         <w:spacing w:after="80"/>
       </w:pPr>
       <w:r>
-        <w:t>Wait for GitHub's confirmation that the import completed — a status banner on the new repo page, or a confirmation email — then open the repo once to confirm it imported successfully.</w:t>
+        <w:t>After selecting Begin import, leave the import-status page open in a browser tab and continue to Basic configuration exploring without waiting. Check the import status again before Debug it with the agent; GitHub shows a completion status and also sends a confirmation email. The background import duration varies.</w:t>
       </w:r>
     </w:p>
     <w:tbl>
@@ -506,7 +506,7 @@
                 <w:i/>
                 <w:iCs/>
               </w:rPr>
-              <w:t>You won't need to browse the code yet — just confirm the import finished. You'll come back to this exact repo in the Debug task, where the SRE Agent will read from it directly.</w:t>
+              <w:t>You won't need to browse the code yet — start the import and continue to the next section without waiting. You'll come back to this exact repo in the Debug task, where the SRE Agent will read from it directly.</w:t>
             </w:r>
           </w:p>
         </w:tc>
@@ -1540,7 +1540,7 @@
         <w:spacing w:after="140"/>
       </w:pPr>
       <w:r>
-        <w:t>Start a new chat thread and describe the symptom the way an on-call engineer would hear it reported — don't give away the cause:</w:t>
+        <w:t>First, return to the repository's import-status tab and confirm the import completed. Open the imported repository and confirm its files are visible. If it is still importing, finish reviewing the preceding activities and check again; do not start this investigation until the repository is ready. Then start a new chat thread and describe the symptom the way an on-call engineer would hear it reported — don't give away the cause:</w:t>
       </w:r>
     </w:p>
     <w:tbl>

</xml_diff>

<commit_message>
Add onboarding-thread activity and live VM screenshot
Co-authored-by: Copilot App <223556219+Copilot@users.noreply.github.com>
</commit_message>
<xml_diff>
--- a/LAB720-Ignite-Day-Lab-25min.docx
+++ b/LAB720-Ignite-Day-Lab-25min.docx
@@ -132,7 +132,7 @@
         <w:spacing w:after="60"/>
       </w:pPr>
       <w:r>
-        <w:t>Review how an Azure SRE Agent's permissions are scoped across a subscription and a resource group.</w:t>
+        <w:t>Interact with the agent's onboarding thread, then review how its permissions are scoped across a subscription and a resource group.</w:t>
       </w:r>
     </w:p>
     <w:p>
@@ -445,7 +445,7 @@
         <w:spacing w:after="80"/>
       </w:pPr>
       <w:r>
-        <w:t>After selecting Begin import, leave the import-status page open in a browser tab and continue to Basic configuration exploring without waiting. Check the import status again before Debug it with the agent; GitHub shows a completion status and also sends a confirmation email. The background import duration varies.</w:t>
+        <w:t>After selecting Begin import, leave the import-status page open in a browser tab and continue to Interact with the onboarding thread without waiting. Check the import status again before Debug it with the agent; GitHub shows a completion status and also sends a confirmation email. The background import duration varies.</w:t>
       </w:r>
     </w:p>
     <w:tbl>
@@ -517,7 +517,90 @@
         <w:pStyle w:val="Heading2"/>
       </w:pPr>
       <w:r>
-        <w:t>Basic configuration exploring</w:t>
+        <w:t>Interact with the onboarding thread</w:t>
+      </w:r>
+    </w:p>
+    <w:p>
+      <w:r>
+        <w:t xml:space="preserve">Open the Azure SRE Agent for your lab. The onboarding thread usually opens automatically when you launch the agent.</w:t>
+      </w:r>
+    </w:p>
+    <w:p>
+      <w:r>
+        <w:t xml:space="preserve">If it does not open, find the onboarding thread under Chats in the left navigation pane. You may also see Team onboarding under Favorites; otherwise, use Search Threads to locate it. Thread titles can vary.</w:t>
+      </w:r>
+    </w:p>
+    <w:p>
+      <w:r>
+        <w:t xml:space="preserve">Read the onboarding conversation and review what the agent has discovered about the environment. Notice any saved knowledge files, missing connections, and suggested next steps.</w:t>
+      </w:r>
+    </w:p>
+    <w:p>
+      <w:r>
+        <w:t xml:space="preserve">Reply to any onboarding questions using the lab scenario: you are the on-call engineer for Caldova Retail Co. Ask a follow-up question about the agent's environment summary if anything is unclear. Keep this interaction read-only; do not request resource changes or enter personal or confidential information.</w:t>
+      </w:r>
+    </w:p>
+    <w:p>
+      <w:r>
+        <w:t xml:space="preserve">If the agent is still processing your reply, continue to Basic configuration exploring and return to this thread to review the response. Do not wait idle or assume an unfinished action has completed.</w:t>
+      </w:r>
+    </w:p>
+    <w:p xmlns:w="http://schemas.openxmlformats.org/wordprocessingml/2006/main" xmlns:r="http://schemas.openxmlformats.org/officeDocument/2006/relationships" xmlns:wp="http://schemas.openxmlformats.org/drawingml/2006/wordprocessingDrawing" xmlns:a="http://schemas.openxmlformats.org/drawingml/2006/main" xmlns:pic="http://schemas.openxmlformats.org/drawingml/2006/picture">
+      <w:pPr>
+        <w:jc w:val="center"/>
+      </w:pPr>
+      <w:r>
+        <w:drawing>
+          <wp:inline distT="0" distB="0" distL="0" distR="0">
+            <wp:extent cx="5943600" cy="2412175"/>
+            <wp:effectExtent l="0" t="0" r="0" b="0"/>
+            <wp:docPr id="2038397334" name="Picture 2038397334" descr="Live lab onboarding thread showing Team onboarding in the left navigation, saved environment knowledge, suggested next steps, and the chat composer. Only the two top informational banners were removed."/>
+            <wp:cNvGraphicFramePr>
+              <a:graphicFrameLocks noChangeAspect="1"/>
+            </wp:cNvGraphicFramePr>
+            <a:graphic>
+              <a:graphicData uri="http://schemas.openxmlformats.org/drawingml/2006/picture">
+                <pic:pic>
+                  <pic:nvPicPr>
+                    <pic:cNvPr id="2038397334" name="Picture 2038397334" descr="Live lab onboarding thread showing Team onboarding in the left navigation, saved environment knowledge, suggested next steps, and the chat composer. Only the two top informational banners were removed."/>
+                    <pic:cNvPicPr/>
+                  </pic:nvPicPr>
+                  <pic:blipFill>
+                    <a:blip r:embed="rId23"/>
+                    <a:stretch>
+                      <a:fillRect/>
+                    </a:stretch>
+                  </pic:blipFill>
+                  <pic:spPr>
+                    <a:xfrm>
+                      <a:off x="0" y="0"/>
+                      <a:ext cx="5943600" cy="2412175"/>
+                    </a:xfrm>
+                    <a:prstGeom prst="rect">
+                      <a:avLst/>
+                    </a:prstGeom>
+                  </pic:spPr>
+                </pic:pic>
+              </a:graphicData>
+            </a:graphic>
+          </wp:inline>
+        </w:drawing>
+      </w:r>
+    </w:p>
+    <w:p>
+      <w:pPr>
+        <w:jc w:val="center"/>
+      </w:pPr>
+      <w:r>
+        <w:t xml:space="preserve">The onboarding thread in the lab VM, with the navigation and chat controls visible.</w:t>
+      </w:r>
+    </w:p>
+    <w:p>
+      <w:pPr>
+        <w:pStyle w:val="Heading2"/>
+      </w:pPr>
+      <w:r>
+        <w:t xml:space="preserve">Basic configuration exploring</w:t>
       </w:r>
     </w:p>
     <w:p>
@@ -3053,7 +3136,7 @@
         <w:spacing w:after="140"/>
       </w:pPr>
       <w:r>
-        <w:t>Congratulations. In this lab you reviewed how an Azure SRE Agent's access is scoped, ran a live discovery prompt against a real Web App, approved a small configuration change it proposed, used it to investigate and fix a live production-style failure, scheduled a recurring read-only audit that reports on its own, and built a live dashboard backed by real telemetry.</w:t>
+        <w:t>Congratulations. In this lab you interacted with the agent's onboarding thread, reviewed how an Azure SRE Agent's access is scoped, ran a live discovery prompt against a real Web App, approved a small configuration change it proposed, used it to investigate and fix a live production-style failure, scheduled a recurring read-only audit that reports on its own, and built a live dashboard backed by real telemetry.</w:t>
       </w:r>
     </w:p>
     <w:p>

</xml_diff>

<commit_message>
Use numbered onboarding steps with verified navigation paths
Co-authored-by: Copilot App <223556219+Copilot@users.noreply.github.com>
</commit_message>
<xml_diff>
--- a/LAB720-Ignite-Day-Lab-25min.docx
+++ b/LAB720-Ignite-Day-Lab-25min.docx
@@ -521,28 +521,120 @@
       </w:r>
     </w:p>
     <w:p>
-      <w:r>
-        <w:t xml:space="preserve">Open the Azure SRE Agent for your lab. The onboarding thread usually opens automatically when you launch the agent.</w:t>
-      </w:r>
-    </w:p>
-    <w:p>
-      <w:r>
-        <w:t xml:space="preserve">If it does not open, find the onboarding thread under Chats in the left navigation pane. You may also see Team onboarding under Favorites; otherwise, use Search Threads to locate it. Thread titles can vary.</w:t>
-      </w:r>
-    </w:p>
-    <w:p>
-      <w:r>
-        <w:t xml:space="preserve">Read the onboarding conversation and review what the agent has discovered about the environment. Notice any saved knowledge files, missing connections, and suggested next steps.</w:t>
-      </w:r>
-    </w:p>
-    <w:p>
-      <w:r>
-        <w:t xml:space="preserve">Reply to any onboarding questions using the lab scenario: you are the on-call engineer for Caldova Retail Co. Ask a follow-up question about the agent's environment summary if anything is unclear. Keep this interaction read-only; do not request resource changes or enter personal or confidential information.</w:t>
-      </w:r>
-    </w:p>
-    <w:p>
-      <w:r>
-        <w:t xml:space="preserve">If the agent is still processing your reply, continue to Basic configuration exploring and return to this thread to review the response. Do not wait idle or assume an unfinished action has completed.</w:t>
+      <w:pPr>
+        <w:pStyle w:val="ListParagraph"/>
+        <w:numPr>
+          <w:ilvl w:val="0"/>
+          <w:numId w:val="12"/>
+        </w:numPr>
+        <w:spacing w:after="80"/>
+      </w:pPr>
+      <w:r>
+        <w:t xml:space="preserve">Open the Azure SRE Agent for your lab. If the onboarding thread opens automatically, go to step 6.</w:t>
+      </w:r>
+    </w:p>
+    <w:p>
+      <w:pPr>
+        <w:pStyle w:val="ListParagraph"/>
+        <w:numPr>
+          <w:ilvl w:val="0"/>
+          <w:numId w:val="12"/>
+        </w:numPr>
+        <w:spacing w:after="80"/>
+      </w:pPr>
+      <w:r>
+        <w:t xml:space="preserve">Otherwise, in the left navigation pane, under Favorites, select Team onboarding. If the thread opens, go to step 6.</w:t>
+      </w:r>
+    </w:p>
+    <w:p>
+      <w:pPr>
+        <w:pStyle w:val="ListParagraph"/>
+        <w:numPr>
+          <w:ilvl w:val="0"/>
+          <w:numId w:val="12"/>
+        </w:numPr>
+        <w:spacing w:after="80"/>
+      </w:pPr>
+      <w:r>
+        <w:t xml:space="preserve">If Team onboarding is not listed, select Search Threads in the left navigation pane.</w:t>
+      </w:r>
+    </w:p>
+    <w:p>
+      <w:pPr>
+        <w:pStyle w:val="ListParagraph"/>
+        <w:numPr>
+          <w:ilvl w:val="0"/>
+          <w:numId w:val="12"/>
+        </w:numPr>
+        <w:spacing w:after="80"/>
+      </w:pPr>
+      <w:r>
+        <w:t xml:space="preserve">In the search box, enter get to know.</w:t>
+      </w:r>
+    </w:p>
+    <w:p>
+      <w:pPr>
+        <w:pStyle w:val="ListParagraph"/>
+        <w:numPr>
+          <w:ilvl w:val="0"/>
+          <w:numId w:val="12"/>
+        </w:numPr>
+        <w:spacing w:after="80"/>
+      </w:pPr>
+      <w:r>
+        <w:t xml:space="preserve">Select the result titled "Hey &lt;your lab user&gt;, let's get to know each other!". The greeting uses your lab account name.</w:t>
+      </w:r>
+    </w:p>
+    <w:p>
+      <w:pPr>
+        <w:pStyle w:val="ListParagraph"/>
+        <w:numPr>
+          <w:ilvl w:val="0"/>
+          <w:numId w:val="12"/>
+        </w:numPr>
+        <w:spacing w:after="80"/>
+      </w:pPr>
+      <w:r>
+        <w:t xml:space="preserve">Read the onboarding conversation and environment summary. Review any saved knowledge files, missing connections, and suggested next steps.</w:t>
+      </w:r>
+    </w:p>
+    <w:p>
+      <w:pPr>
+        <w:pStyle w:val="ListParagraph"/>
+        <w:numPr>
+          <w:ilvl w:val="0"/>
+          <w:numId w:val="12"/>
+        </w:numPr>
+        <w:spacing w:after="80"/>
+      </w:pPr>
+      <w:r>
+        <w:t xml:space="preserve">Reply to the onboarding questions as the on-call engineer for Caldova Retail Co.</w:t>
+      </w:r>
+    </w:p>
+    <w:p>
+      <w:pPr>
+        <w:pStyle w:val="ListParagraph"/>
+        <w:numPr>
+          <w:ilvl w:val="0"/>
+          <w:numId w:val="12"/>
+        </w:numPr>
+        <w:spacing w:after="80"/>
+      </w:pPr>
+      <w:r>
+        <w:t xml:space="preserve">Ask a follow-up question if needed. Keep the interaction read-only; do not request resource changes or enter personal or confidential information.</w:t>
+      </w:r>
+    </w:p>
+    <w:p>
+      <w:pPr>
+        <w:pStyle w:val="ListParagraph"/>
+        <w:numPr>
+          <w:ilvl w:val="0"/>
+          <w:numId w:val="12"/>
+        </w:numPr>
+        <w:spacing w:after="80"/>
+      </w:pPr>
+      <w:r>
+        <w:t xml:space="preserve">If the agent is still processing, continue to Basic configuration exploring. Return later to review its response.</w:t>
       </w:r>
     </w:p>
     <w:p xmlns:w="http://schemas.openxmlformats.org/wordprocessingml/2006/main" xmlns:r="http://schemas.openxmlformats.org/officeDocument/2006/relationships" xmlns:wp="http://schemas.openxmlformats.org/drawingml/2006/wordprocessingDrawing" xmlns:a="http://schemas.openxmlformats.org/drawingml/2006/main" xmlns:pic="http://schemas.openxmlformats.org/drawingml/2006/picture">
@@ -4013,6 +4105,12 @@
   </w:num>
   <w:num w:numId="11" w16cid:durableId="629017917">
     <w:abstractNumId w:val="2"/>
+    <w:lvlOverride w:ilvl="0">
+      <w:startOverride w:val="1"/>
+    </w:lvlOverride>
+  </w:num>
+  <w:num w:numId="12">
+    <w:abstractNumId w:val="8"/>
     <w:lvlOverride w:ilvl="0">
       <w:startOverride w:val="1"/>
     </w:lvlOverride>

</xml_diff>

<commit_message>
Remove UI banners from lab screenshots
Clean six screenshot assets and their embedded copies in both lab documents. Preserve all other pixels and adjust drawing heights to retain image aspect ratios.

Co-authored-by: Copilot App <223556219+Copilot@users.noreply.github.com>
</commit_message>
<xml_diff>
--- a/LAB720-Ignite-Day-Lab-25min.docx
+++ b/LAB720-Ignite-Day-Lab-25min.docx
@@ -1171,7 +1171,7 @@
         <w:lastRenderedPageBreak/>
         <w:drawing>
           <wp:inline distT="0" distB="0" distL="0" distR="0" wp14:anchorId="5ED093E2" wp14:editId="02C62C48">
-            <wp:extent cx="4381500" cy="4352925"/>
+            <wp:extent cx="4381500" cy="3901336"/>
             <wp:effectExtent l="0" t="0" r="0" b="0"/>
             <wp:docPr id="125102876" name="The agent's discovery response: health, configuration, app settings, and identified gaps." descr="The agent's discovery response: health, configuration, app settings, and identified gaps." title="The agent's discovery response: health, configuration, app settings, and identified gaps."/>
             <wp:cNvGraphicFramePr>
@@ -1196,7 +1196,7 @@
                   <pic:spPr bwMode="auto">
                     <a:xfrm>
                       <a:off x="0" y="0"/>
-                      <a:ext cx="4381500" cy="4352925"/>
+                      <a:ext cx="4381500" cy="3901336"/>
                     </a:xfrm>
                     <a:prstGeom prst="rect">
                       <a:avLst/>
@@ -1387,7 +1387,7 @@
         <w:lastRenderedPageBreak/>
         <w:drawing>
           <wp:inline distT="0" distB="0" distL="0" distR="0" wp14:anchorId="079D7E35" wp14:editId="3FFF65A3">
-            <wp:extent cx="4381500" cy="4352925"/>
+            <wp:extent cx="4381500" cy="3901336"/>
             <wp:effectExtent l="0" t="0" r="0" b="0"/>
             <wp:docPr id="1252918739" name="Approval prompt for the Health check path configuration change, with the exact CLI command and rollback shown." descr="Approval prompt for the Health check path configuration change, with the exact CLI command and rollback shown." title="Approval prompt for the Health check path configuration change, with the exact CLI command and rollback shown."/>
             <wp:cNvGraphicFramePr>
@@ -1412,7 +1412,7 @@
                   <pic:spPr bwMode="auto">
                     <a:xfrm>
                       <a:off x="0" y="0"/>
-                      <a:ext cx="4381500" cy="4352925"/>
+                      <a:ext cx="4381500" cy="3901336"/>
                     </a:xfrm>
                     <a:prstGeom prst="rect">
                       <a:avLst/>
@@ -1989,7 +1989,7 @@
         </w:rPr>
         <w:drawing>
           <wp:inline distT="0" distB="0" distL="0" distR="0" wp14:anchorId="2E0F36B6" wp14:editId="18B2B5CB">
-            <wp:extent cx="4381500" cy="4352925"/>
+            <wp:extent cx="4381500" cy="3901336"/>
             <wp:effectExtent l="0" t="0" r="0" b="0"/>
             <wp:docPr id="2038397333" name="The corrected fix: updating Catalog__AsOfDate to today's date instead of deleting the setting." descr="The corrected fix: updating Catalog__AsOfDate to today's date instead of deleting the setting." title="The corrected fix: updating Catalog__AsOfDate to today's date instead of deleting the setting."/>
             <wp:cNvGraphicFramePr>
@@ -2014,7 +2014,7 @@
                   <pic:spPr bwMode="auto">
                     <a:xfrm>
                       <a:off x="0" y="0"/>
-                      <a:ext cx="4381500" cy="4352925"/>
+                      <a:ext cx="4381500" cy="3901336"/>
                     </a:xfrm>
                     <a:prstGeom prst="rect">
                       <a:avLst/>
@@ -2481,7 +2481,7 @@
         </w:rPr>
         <w:drawing>
           <wp:inline distT="0" distB="0" distL="0" distR="0" wp14:anchorId="1AF4DFC6" wp14:editId="3F397D28">
-            <wp:extent cx="4381500" cy="4352925"/>
+            <wp:extent cx="4381500" cy="3901336"/>
             <wp:effectExtent l="0" t="0" r="0" b="0"/>
             <wp:docPr id="772426326" name="A completed Weekly Cloud Cost Audit run: posture summary, SEV-rated findings, recommendations, and a downloadable, Caldova-branded PowerPoint deck." descr="A completed Weekly Cloud Cost Audit run: posture summary, SEV-rated findings, recommendations, and a downloadable, Caldova-branded PowerPoint deck." title="A completed Weekly Cloud Cost Audit run: posture summary, SEV-rated findings, recommendations, and a downloadable, Caldova-branded PowerPoint deck."/>
             <wp:cNvGraphicFramePr>
@@ -2506,7 +2506,7 @@
                   <pic:spPr bwMode="auto">
                     <a:xfrm>
                       <a:off x="0" y="0"/>
-                      <a:ext cx="4381500" cy="4352925"/>
+                      <a:ext cx="4381500" cy="3901336"/>
                     </a:xfrm>
                     <a:prstGeom prst="rect">
                       <a:avLst/>
@@ -3007,7 +3007,7 @@
         <w:lastRenderedPageBreak/>
         <w:drawing>
           <wp:inline distT="0" distB="0" distL="0" distR="0" wp14:anchorId="1B833349" wp14:editId="13534380">
-            <wp:extent cx="4381500" cy="4352925"/>
+            <wp:extent cx="4381500" cy="4067275"/>
             <wp:effectExtent l="0" t="0" r="0" b="0"/>
             <wp:docPr id="1528600554" name="The live report's health summary tiles and traffic trend chart." descr="The live report's health summary tiles and traffic trend chart." title="The live report's health summary tiles and traffic trend chart."/>
             <wp:cNvGraphicFramePr>
@@ -3032,7 +3032,7 @@
                   <pic:spPr bwMode="auto">
                     <a:xfrm>
                       <a:off x="0" y="0"/>
-                      <a:ext cx="4381500" cy="4352925"/>
+                      <a:ext cx="4381500" cy="4067275"/>
                     </a:xfrm>
                     <a:prstGeom prst="rect">
                       <a:avLst/>
@@ -3073,7 +3073,7 @@
         <w:lastRenderedPageBreak/>
         <w:drawing>
           <wp:inline distT="0" distB="0" distL="0" distR="0" wp14:anchorId="7C514004" wp14:editId="5411D456">
-            <wp:extent cx="4381500" cy="4352925"/>
+            <wp:extent cx="4381500" cy="4067275"/>
             <wp:effectExtent l="0" t="0" r="0" b="0"/>
             <wp:docPr id="13926739" name="The same live report, scrolled down to Top Requested URLs, Top Failing URLs, and the country/region breakdown." descr="The same live report, scrolled down to Top Requested URLs, Top Failing URLs, and the country/region breakdown." title="The same live report, scrolled down to Top Requested URLs, Top Failing URLs, and the country/region breakdown."/>
             <wp:cNvGraphicFramePr>
@@ -3098,7 +3098,7 @@
                   <pic:spPr bwMode="auto">
                     <a:xfrm>
                       <a:off x="0" y="0"/>
-                      <a:ext cx="4381500" cy="4352925"/>
+                      <a:ext cx="4381500" cy="4067275"/>
                     </a:xfrm>
                     <a:prstGeom prst="rect">
                       <a:avLst/>

</xml_diff>

<commit_message>
Discard superseded screenshot edits
Keep the published branch on the original captures until the requested fresh retakes are ready.

Co-authored-by: Copilot App <223556219+Copilot@users.noreply.github.com>
</commit_message>
<xml_diff>
--- a/LAB720-Ignite-Day-Lab-25min.docx
+++ b/LAB720-Ignite-Day-Lab-25min.docx
@@ -1171,7 +1171,7 @@
         <w:lastRenderedPageBreak/>
         <w:drawing>
           <wp:inline distT="0" distB="0" distL="0" distR="0" wp14:anchorId="5ED093E2" wp14:editId="02C62C48">
-            <wp:extent cx="4381500" cy="3901336"/>
+            <wp:extent cx="4381500" cy="4352925"/>
             <wp:effectExtent l="0" t="0" r="0" b="0"/>
             <wp:docPr id="125102876" name="The agent's discovery response: health, configuration, app settings, and identified gaps." descr="The agent's discovery response: health, configuration, app settings, and identified gaps." title="The agent's discovery response: health, configuration, app settings, and identified gaps."/>
             <wp:cNvGraphicFramePr>
@@ -1196,7 +1196,7 @@
                   <pic:spPr bwMode="auto">
                     <a:xfrm>
                       <a:off x="0" y="0"/>
-                      <a:ext cx="4381500" cy="3901336"/>
+                      <a:ext cx="4381500" cy="4352925"/>
                     </a:xfrm>
                     <a:prstGeom prst="rect">
                       <a:avLst/>
@@ -1387,7 +1387,7 @@
         <w:lastRenderedPageBreak/>
         <w:drawing>
           <wp:inline distT="0" distB="0" distL="0" distR="0" wp14:anchorId="079D7E35" wp14:editId="3FFF65A3">
-            <wp:extent cx="4381500" cy="3901336"/>
+            <wp:extent cx="4381500" cy="4352925"/>
             <wp:effectExtent l="0" t="0" r="0" b="0"/>
             <wp:docPr id="1252918739" name="Approval prompt for the Health check path configuration change, with the exact CLI command and rollback shown." descr="Approval prompt for the Health check path configuration change, with the exact CLI command and rollback shown." title="Approval prompt for the Health check path configuration change, with the exact CLI command and rollback shown."/>
             <wp:cNvGraphicFramePr>
@@ -1412,7 +1412,7 @@
                   <pic:spPr bwMode="auto">
                     <a:xfrm>
                       <a:off x="0" y="0"/>
-                      <a:ext cx="4381500" cy="3901336"/>
+                      <a:ext cx="4381500" cy="4352925"/>
                     </a:xfrm>
                     <a:prstGeom prst="rect">
                       <a:avLst/>
@@ -1989,7 +1989,7 @@
         </w:rPr>
         <w:drawing>
           <wp:inline distT="0" distB="0" distL="0" distR="0" wp14:anchorId="2E0F36B6" wp14:editId="18B2B5CB">
-            <wp:extent cx="4381500" cy="3901336"/>
+            <wp:extent cx="4381500" cy="4352925"/>
             <wp:effectExtent l="0" t="0" r="0" b="0"/>
             <wp:docPr id="2038397333" name="The corrected fix: updating Catalog__AsOfDate to today's date instead of deleting the setting." descr="The corrected fix: updating Catalog__AsOfDate to today's date instead of deleting the setting." title="The corrected fix: updating Catalog__AsOfDate to today's date instead of deleting the setting."/>
             <wp:cNvGraphicFramePr>
@@ -2014,7 +2014,7 @@
                   <pic:spPr bwMode="auto">
                     <a:xfrm>
                       <a:off x="0" y="0"/>
-                      <a:ext cx="4381500" cy="3901336"/>
+                      <a:ext cx="4381500" cy="4352925"/>
                     </a:xfrm>
                     <a:prstGeom prst="rect">
                       <a:avLst/>
@@ -2481,7 +2481,7 @@
         </w:rPr>
         <w:drawing>
           <wp:inline distT="0" distB="0" distL="0" distR="0" wp14:anchorId="1AF4DFC6" wp14:editId="3F397D28">
-            <wp:extent cx="4381500" cy="3901336"/>
+            <wp:extent cx="4381500" cy="4352925"/>
             <wp:effectExtent l="0" t="0" r="0" b="0"/>
             <wp:docPr id="772426326" name="A completed Weekly Cloud Cost Audit run: posture summary, SEV-rated findings, recommendations, and a downloadable, Caldova-branded PowerPoint deck." descr="A completed Weekly Cloud Cost Audit run: posture summary, SEV-rated findings, recommendations, and a downloadable, Caldova-branded PowerPoint deck." title="A completed Weekly Cloud Cost Audit run: posture summary, SEV-rated findings, recommendations, and a downloadable, Caldova-branded PowerPoint deck."/>
             <wp:cNvGraphicFramePr>
@@ -2506,7 +2506,7 @@
                   <pic:spPr bwMode="auto">
                     <a:xfrm>
                       <a:off x="0" y="0"/>
-                      <a:ext cx="4381500" cy="3901336"/>
+                      <a:ext cx="4381500" cy="4352925"/>
                     </a:xfrm>
                     <a:prstGeom prst="rect">
                       <a:avLst/>
@@ -3007,7 +3007,7 @@
         <w:lastRenderedPageBreak/>
         <w:drawing>
           <wp:inline distT="0" distB="0" distL="0" distR="0" wp14:anchorId="1B833349" wp14:editId="13534380">
-            <wp:extent cx="4381500" cy="4067275"/>
+            <wp:extent cx="4381500" cy="4352925"/>
             <wp:effectExtent l="0" t="0" r="0" b="0"/>
             <wp:docPr id="1528600554" name="The live report's health summary tiles and traffic trend chart." descr="The live report's health summary tiles and traffic trend chart." title="The live report's health summary tiles and traffic trend chart."/>
             <wp:cNvGraphicFramePr>
@@ -3032,7 +3032,7 @@
                   <pic:spPr bwMode="auto">
                     <a:xfrm>
                       <a:off x="0" y="0"/>
-                      <a:ext cx="4381500" cy="4067275"/>
+                      <a:ext cx="4381500" cy="4352925"/>
                     </a:xfrm>
                     <a:prstGeom prst="rect">
                       <a:avLst/>
@@ -3073,7 +3073,7 @@
         <w:lastRenderedPageBreak/>
         <w:drawing>
           <wp:inline distT="0" distB="0" distL="0" distR="0" wp14:anchorId="7C514004" wp14:editId="5411D456">
-            <wp:extent cx="4381500" cy="4067275"/>
+            <wp:extent cx="4381500" cy="4352925"/>
             <wp:effectExtent l="0" t="0" r="0" b="0"/>
             <wp:docPr id="13926739" name="The same live report, scrolled down to Top Requested URLs, Top Failing URLs, and the country/region breakdown." descr="The same live report, scrolled down to Top Requested URLs, Top Failing URLs, and the country/region breakdown." title="The same live report, scrolled down to Top Requested URLs, Top Failing URLs, and the country/region breakdown."/>
             <wp:cNvGraphicFramePr>
@@ -3098,7 +3098,7 @@
                   <pic:spPr bwMode="auto">
                     <a:xfrm>
                       <a:off x="0" y="0"/>
-                      <a:ext cx="4381500" cy="4067275"/>
+                      <a:ext cx="4381500" cy="4352925"/>
                     </a:xfrm>
                     <a:prstGeom prst="rect">
                       <a:avLst/>

</xml_diff>